<commit_message>
docs(SCRUM-165): registro de cambios V1 a V2 del documento
Se corrige la afirmación de que no existía un V1 y se listan las 13
diferencias reales contra el Documento V1 del 16-sep.
</commit_message>
<xml_diff>
--- a/docs/comite-2/Documento_V2_FusaRoute.docx
+++ b/docs/comite-2/Documento_V2_FusaRoute.docx
@@ -468,7 +468,1062 @@
           <w:b w:val="0"/>
           <w:i w:val="0"/>
         </w:rPr>
-        <w:t>Este documento no parte de un Documento V1 con la estructura de nueve secciones: en el repositorio de la asignatura solo existe la estructura que pide el docente (Entregable Documento V1) y la Actividad 3 en su versión 3. Este V2 toma como base esa Actividad 3 y todos los cambios aprobados desde entonces, y los reorganiza en la estructura completa del docente. Cada cambio queda registrado con su razón, porque ante el comité cambiar de decisión con argumentos suma y cambiar sin registrar el porqué resta.</w:t>
+        <w:t>Este V2 corrige y amplía el Documento V1 entregado el 16 de septiembre de 2026, con la misma estructura del docente. Desde esa fecha se aprobó el backlog completo (15 historias y 7 requisitos no funcionales), se decidió el despliegue real y se implementó el primer incremento, por lo que varias afirmaciones del V1 dejaron de ser ciertas. Cada cambio queda registrado con su razón, porque ante el comité cambiar de decisión con argumentos suma y cambiar sin registrar el porqué resta.</w:t>
+      </w:r>
+    </w:p>
+    <w:p>
+      <w:pPr>
+        <w:pStyle w:val="Heading3"/>
+      </w:pPr>
+      <w:r>
+        <w:t>De qué cambió el V1 al V2</w:t>
+      </w:r>
+    </w:p>
+    <w:tbl>
+      <w:tblPr>
+        <w:tblStyle w:val="TableGrid"/>
+        <w:tblW w:type="auto" w:w="0"/>
+        <w:jc w:val="center"/>
+        <w:tblLayout w:type="fixed"/>
+        <w:tblLook w:firstColumn="1" w:firstRow="1" w:lastColumn="0" w:lastRow="0" w:noHBand="0" w:noVBand="1" w:val="04A0"/>
+      </w:tblPr>
+      <w:tblGrid>
+        <w:gridCol w:w="1474"/>
+        <w:gridCol w:w="2154"/>
+        <w:gridCol w:w="2721"/>
+        <w:gridCol w:w="3572"/>
+      </w:tblGrid>
+      <w:tr>
+        <w:trPr>
+          <w:cantSplit w:val="true"/>
+          <w:tblHeader w:val="true"/>
+        </w:trPr>
+        <w:tc>
+          <w:tcPr>
+            <w:tcW w:type="dxa" w:w="1474"/>
+            <w:shd w:val="clear" w:color="auto" w:fill="D9E2F3"/>
+          </w:tcPr>
+          <w:p>
+            <w:r/>
+            <w:r>
+              <w:rPr>
+                <w:b/>
+                <w:sz w:val="17"/>
+              </w:rPr>
+              <w:t>Tema</w:t>
+            </w:r>
+          </w:p>
+        </w:tc>
+        <w:tc>
+          <w:tcPr>
+            <w:tcW w:type="dxa" w:w="2154"/>
+            <w:shd w:val="clear" w:color="auto" w:fill="D9E2F3"/>
+          </w:tcPr>
+          <w:p>
+            <w:r/>
+            <w:r>
+              <w:rPr>
+                <w:b/>
+                <w:sz w:val="17"/>
+              </w:rPr>
+              <w:t>Documento V1 (16/09)</w:t>
+            </w:r>
+          </w:p>
+        </w:tc>
+        <w:tc>
+          <w:tcPr>
+            <w:tcW w:type="dxa" w:w="2721"/>
+            <w:shd w:val="clear" w:color="auto" w:fill="D9E2F3"/>
+          </w:tcPr>
+          <w:p>
+            <w:r/>
+            <w:r>
+              <w:rPr>
+                <w:b/>
+                <w:sz w:val="17"/>
+              </w:rPr>
+              <w:t>Documento V2 (28/09)</w:t>
+            </w:r>
+          </w:p>
+        </w:tc>
+        <w:tc>
+          <w:tcPr>
+            <w:tcW w:type="dxa" w:w="3572"/>
+            <w:shd w:val="clear" w:color="auto" w:fill="D9E2F3"/>
+          </w:tcPr>
+          <w:p>
+            <w:r/>
+            <w:r>
+              <w:rPr>
+                <w:b/>
+                <w:sz w:val="17"/>
+              </w:rPr>
+              <w:t>Razón</w:t>
+            </w:r>
+          </w:p>
+        </w:tc>
+      </w:tr>
+      <w:tr>
+        <w:trPr>
+          <w:cantSplit w:val="true"/>
+        </w:trPr>
+        <w:tc>
+          <w:tcPr>
+            <w:tcW w:type="dxa" w:w="1474"/>
+          </w:tcPr>
+          <w:p>
+            <w:pPr>
+              <w:spacing w:after="40"/>
+            </w:pPr>
+            <w:r/>
+            <w:r>
+              <w:rPr>
+                <w:sz w:val="17"/>
+              </w:rPr>
+              <w:t>Sprints</w:t>
+            </w:r>
+          </w:p>
+        </w:tc>
+        <w:tc>
+          <w:tcPr>
+            <w:tcW w:type="dxa" w:w="2154"/>
+          </w:tcPr>
+          <w:p>
+            <w:pPr>
+              <w:spacing w:after="40"/>
+            </w:pPr>
+            <w:r/>
+            <w:r>
+              <w:rPr>
+                <w:sz w:val="17"/>
+              </w:rPr>
+              <w:t>2 semanas</w:t>
+            </w:r>
+          </w:p>
+        </w:tc>
+        <w:tc>
+          <w:tcPr>
+            <w:tcW w:type="dxa" w:w="2721"/>
+          </w:tcPr>
+          <w:p>
+            <w:pPr>
+              <w:spacing w:after="40"/>
+            </w:pPr>
+            <w:r/>
+            <w:r>
+              <w:rPr>
+                <w:sz w:val="17"/>
+              </w:rPr>
+              <w:t>1 semana, de martes a lunes</w:t>
+            </w:r>
+          </w:p>
+        </w:tc>
+        <w:tc>
+          <w:tcPr>
+            <w:tcW w:type="dxa" w:w="3572"/>
+          </w:tcPr>
+          <w:p>
+            <w:pPr>
+              <w:spacing w:after="40"/>
+            </w:pPr>
+            <w:r/>
+            <w:r>
+              <w:rPr>
+                <w:sz w:val="17"/>
+              </w:rPr>
+              <w:t>Que a cada sustentación quincenal lleguen dos sprints cerrados con su informe.</w:t>
+            </w:r>
+          </w:p>
+        </w:tc>
+      </w:tr>
+      <w:tr>
+        <w:trPr>
+          <w:cantSplit w:val="true"/>
+        </w:trPr>
+        <w:tc>
+          <w:tcPr>
+            <w:tcW w:type="dxa" w:w="1474"/>
+          </w:tcPr>
+          <w:p>
+            <w:pPr>
+              <w:spacing w:after="40"/>
+            </w:pPr>
+            <w:r/>
+            <w:r>
+              <w:rPr>
+                <w:sz w:val="17"/>
+              </w:rPr>
+              <w:t>Daily Scrum</w:t>
+            </w:r>
+          </w:p>
+        </w:tc>
+        <w:tc>
+          <w:tcPr>
+            <w:tcW w:type="dxa" w:w="2154"/>
+          </w:tcPr>
+          <w:p>
+            <w:pPr>
+              <w:spacing w:after="40"/>
+            </w:pPr>
+            <w:r/>
+            <w:r>
+              <w:rPr>
+                <w:sz w:val="17"/>
+              </w:rPr>
+              <w:t>Daily Scrums cortos</w:t>
+            </w:r>
+          </w:p>
+        </w:tc>
+        <w:tc>
+          <w:tcPr>
+            <w:tcW w:type="dxa" w:w="2721"/>
+          </w:tcPr>
+          <w:p>
+            <w:pPr>
+              <w:spacing w:after="40"/>
+            </w:pPr>
+            <w:r/>
+            <w:r>
+              <w:rPr>
+                <w:sz w:val="17"/>
+              </w:rPr>
+              <w:t>Check-in escrito (ayer / hoy / bloqueos)</w:t>
+            </w:r>
+          </w:p>
+        </w:tc>
+        <w:tc>
+          <w:tcPr>
+            <w:tcW w:type="dxa" w:w="3572"/>
+          </w:tcPr>
+          <w:p>
+            <w:pPr>
+              <w:spacing w:after="40"/>
+            </w:pPr>
+            <w:r/>
+            <w:r>
+              <w:rPr>
+                <w:sz w:val="17"/>
+              </w:rPr>
+              <w:t>Dos personas con tres clases semanales en común no sostienen una reunión diaria.</w:t>
+            </w:r>
+          </w:p>
+        </w:tc>
+      </w:tr>
+      <w:tr>
+        <w:trPr>
+          <w:cantSplit w:val="true"/>
+        </w:trPr>
+        <w:tc>
+          <w:tcPr>
+            <w:tcW w:type="dxa" w:w="1474"/>
+          </w:tcPr>
+          <w:p>
+            <w:pPr>
+              <w:spacing w:after="40"/>
+            </w:pPr>
+            <w:r/>
+            <w:r>
+              <w:rPr>
+                <w:sz w:val="17"/>
+              </w:rPr>
+              <w:t>Backlog</w:t>
+            </w:r>
+          </w:p>
+        </w:tc>
+        <w:tc>
+          <w:tcPr>
+            <w:tcW w:type="dxa" w:w="2154"/>
+          </w:tcPr>
+          <w:p>
+            <w:pPr>
+              <w:spacing w:after="40"/>
+            </w:pPr>
+            <w:r/>
+            <w:r>
+              <w:rPr>
+                <w:sz w:val="17"/>
+              </w:rPr>
+              <w:t>GitHub Projects</w:t>
+            </w:r>
+          </w:p>
+        </w:tc>
+        <w:tc>
+          <w:tcPr>
+            <w:tcW w:type="dxa" w:w="2721"/>
+          </w:tcPr>
+          <w:p>
+            <w:pPr>
+              <w:spacing w:after="40"/>
+            </w:pPr>
+            <w:r/>
+            <w:r>
+              <w:rPr>
+                <w:sz w:val="17"/>
+              </w:rPr>
+              <w:t>Jira, proyecto SCRUM</w:t>
+            </w:r>
+          </w:p>
+        </w:tc>
+        <w:tc>
+          <w:tcPr>
+            <w:tcW w:type="dxa" w:w="3572"/>
+          </w:tcPr>
+          <w:p>
+            <w:pPr>
+              <w:spacing w:after="40"/>
+            </w:pPr>
+            <w:r/>
+            <w:r>
+              <w:rPr>
+                <w:sz w:val="17"/>
+              </w:rPr>
+              <w:t>Trazabilidad rama–commit–PR por la key SCRUM-N.</w:t>
+            </w:r>
+          </w:p>
+        </w:tc>
+      </w:tr>
+      <w:tr>
+        <w:trPr>
+          <w:cantSplit w:val="true"/>
+        </w:trPr>
+        <w:tc>
+          <w:tcPr>
+            <w:tcW w:type="dxa" w:w="1474"/>
+          </w:tcPr>
+          <w:p>
+            <w:pPr>
+              <w:spacing w:after="40"/>
+            </w:pPr>
+            <w:r/>
+            <w:r>
+              <w:rPr>
+                <w:sz w:val="17"/>
+              </w:rPr>
+              <w:t>Usuarios</w:t>
+            </w:r>
+          </w:p>
+        </w:tc>
+        <w:tc>
+          <w:tcPr>
+            <w:tcW w:type="dxa" w:w="2154"/>
+          </w:tcPr>
+          <w:p>
+            <w:pPr>
+              <w:spacing w:after="40"/>
+            </w:pPr>
+            <w:r/>
+            <w:r>
+              <w:rPr>
+                <w:sz w:val="17"/>
+              </w:rPr>
+              <w:t>2 (usuario y administrador)</w:t>
+            </w:r>
+          </w:p>
+        </w:tc>
+        <w:tc>
+          <w:tcPr>
+            <w:tcW w:type="dxa" w:w="2721"/>
+          </w:tcPr>
+          <w:p>
+            <w:pPr>
+              <w:spacing w:after="40"/>
+            </w:pPr>
+            <w:r/>
+            <w:r>
+              <w:rPr>
+                <w:sz w:val="17"/>
+              </w:rPr>
+              <w:t>3: se agrega el Visitante sin cuenta</w:t>
+            </w:r>
+          </w:p>
+        </w:tc>
+        <w:tc>
+          <w:tcPr>
+            <w:tcW w:type="dxa" w:w="3572"/>
+          </w:tcPr>
+          <w:p>
+            <w:pPr>
+              <w:spacing w:after="40"/>
+            </w:pPr>
+            <w:r/>
+            <w:r>
+              <w:rPr>
+                <w:sz w:val="17"/>
+              </w:rPr>
+              <w:t>El catálogo público de rutas (RF-15) no exige sesión.</w:t>
+            </w:r>
+          </w:p>
+        </w:tc>
+      </w:tr>
+      <w:tr>
+        <w:trPr>
+          <w:cantSplit w:val="true"/>
+        </w:trPr>
+        <w:tc>
+          <w:tcPr>
+            <w:tcW w:type="dxa" w:w="1474"/>
+          </w:tcPr>
+          <w:p>
+            <w:pPr>
+              <w:spacing w:after="40"/>
+            </w:pPr>
+            <w:r/>
+            <w:r>
+              <w:rPr>
+                <w:sz w:val="17"/>
+              </w:rPr>
+              <w:t>Requerimientos funcionales</w:t>
+            </w:r>
+          </w:p>
+        </w:tc>
+        <w:tc>
+          <w:tcPr>
+            <w:tcW w:type="dxa" w:w="2154"/>
+          </w:tcPr>
+          <w:p>
+            <w:pPr>
+              <w:spacing w:after="40"/>
+            </w:pPr>
+            <w:r/>
+            <w:r>
+              <w:rPr>
+                <w:sz w:val="17"/>
+              </w:rPr>
+              <w:t>10 (RF1 a RF10)</w:t>
+            </w:r>
+          </w:p>
+        </w:tc>
+        <w:tc>
+          <w:tcPr>
+            <w:tcW w:type="dxa" w:w="2721"/>
+          </w:tcPr>
+          <w:p>
+            <w:pPr>
+              <w:spacing w:after="40"/>
+            </w:pPr>
+            <w:r/>
+            <w:r>
+              <w:rPr>
+                <w:sz w:val="17"/>
+              </w:rPr>
+              <w:t>15 (RF-01 a RF-15)</w:t>
+            </w:r>
+          </w:p>
+        </w:tc>
+        <w:tc>
+          <w:tcPr>
+            <w:tcW w:type="dxa" w:w="3572"/>
+          </w:tcPr>
+          <w:p>
+            <w:pPr>
+              <w:spacing w:after="40"/>
+            </w:pPr>
+            <w:r/>
+            <w:r>
+              <w:rPr>
+                <w:sz w:val="17"/>
+              </w:rPr>
+              <w:t>Backlog aprobado el 15/09. Ver rutas y Buscar ruta pasan a RF-15 y RF-04; agregar, editar y eliminar rutas se unifican en RF-11; nuevos RF-05 a RF-10, RF-12 a RF-14. El filtro por categoría no forma parte del backlog aprobado.</w:t>
+            </w:r>
+          </w:p>
+        </w:tc>
+      </w:tr>
+      <w:tr>
+        <w:trPr>
+          <w:cantSplit w:val="true"/>
+        </w:trPr>
+        <w:tc>
+          <w:tcPr>
+            <w:tcW w:type="dxa" w:w="1474"/>
+          </w:tcPr>
+          <w:p>
+            <w:pPr>
+              <w:spacing w:after="40"/>
+            </w:pPr>
+            <w:r/>
+            <w:r>
+              <w:rPr>
+                <w:sz w:val="17"/>
+              </w:rPr>
+              <w:t>Prioridades</w:t>
+            </w:r>
+          </w:p>
+        </w:tc>
+        <w:tc>
+          <w:tcPr>
+            <w:tcW w:type="dxa" w:w="2154"/>
+          </w:tcPr>
+          <w:p>
+            <w:pPr>
+              <w:spacing w:after="40"/>
+            </w:pPr>
+            <w:r/>
+            <w:r>
+              <w:rPr>
+                <w:sz w:val="17"/>
+              </w:rPr>
+              <w:t>Registro Media; Perfil y Filtros Baja</w:t>
+            </w:r>
+          </w:p>
+        </w:tc>
+        <w:tc>
+          <w:tcPr>
+            <w:tcW w:type="dxa" w:w="2721"/>
+          </w:tcPr>
+          <w:p>
+            <w:pPr>
+              <w:spacing w:after="40"/>
+            </w:pPr>
+            <w:r/>
+            <w:r>
+              <w:rPr>
+                <w:sz w:val="17"/>
+              </w:rPr>
+              <w:t>Registro Alta; Perfil Media; ninguno Baja</w:t>
+            </w:r>
+          </w:p>
+        </w:tc>
+        <w:tc>
+          <w:tcPr>
+            <w:tcW w:type="dxa" w:w="3572"/>
+          </w:tcPr>
+          <w:p>
+            <w:pPr>
+              <w:spacing w:after="40"/>
+            </w:pPr>
+            <w:r/>
+            <w:r>
+              <w:rPr>
+                <w:sz w:val="17"/>
+              </w:rPr>
+              <w:t>Lo de baja prioridad se sacó del alcance.</w:t>
+            </w:r>
+          </w:p>
+        </w:tc>
+      </w:tr>
+      <w:tr>
+        <w:trPr>
+          <w:cantSplit w:val="true"/>
+        </w:trPr>
+        <w:tc>
+          <w:tcPr>
+            <w:tcW w:type="dxa" w:w="1474"/>
+          </w:tcPr>
+          <w:p>
+            <w:pPr>
+              <w:spacing w:after="40"/>
+            </w:pPr>
+            <w:r/>
+            <w:r>
+              <w:rPr>
+                <w:sz w:val="17"/>
+              </w:rPr>
+              <w:t>Rendimiento</w:t>
+            </w:r>
+          </w:p>
+        </w:tc>
+        <w:tc>
+          <w:tcPr>
+            <w:tcW w:type="dxa" w:w="2154"/>
+          </w:tcPr>
+          <w:p>
+            <w:pPr>
+              <w:spacing w:after="40"/>
+            </w:pPr>
+            <w:r/>
+            <w:r>
+              <w:rPr>
+                <w:sz w:val="17"/>
+              </w:rPr>
+              <w:t>Mapa en menos de 3 s</w:t>
+            </w:r>
+          </w:p>
+        </w:tc>
+        <w:tc>
+          <w:tcPr>
+            <w:tcW w:type="dxa" w:w="2721"/>
+          </w:tcPr>
+          <w:p>
+            <w:pPr>
+              <w:spacing w:after="40"/>
+            </w:pPr>
+            <w:r/>
+            <w:r>
+              <w:rPr>
+                <w:sz w:val="17"/>
+              </w:rPr>
+              <w:t>p95 &lt; 8 s extremo a extremo y LCP &lt; 2,5 s</w:t>
+            </w:r>
+          </w:p>
+        </w:tc>
+        <w:tc>
+          <w:tcPr>
+            <w:tcW w:type="dxa" w:w="3572"/>
+          </w:tcPr>
+          <w:p>
+            <w:pPr>
+              <w:spacing w:after="40"/>
+            </w:pPr>
+            <w:r/>
+            <w:r>
+              <w:rPr>
+                <w:sz w:val="17"/>
+              </w:rPr>
+              <w:t>El cálculo de ruta depende de Google Maps; 3 s no era medible ni realista.</w:t>
+            </w:r>
+          </w:p>
+        </w:tc>
+      </w:tr>
+      <w:tr>
+        <w:trPr>
+          <w:cantSplit w:val="true"/>
+        </w:trPr>
+        <w:tc>
+          <w:tcPr>
+            <w:tcW w:type="dxa" w:w="1474"/>
+          </w:tcPr>
+          <w:p>
+            <w:pPr>
+              <w:spacing w:after="40"/>
+            </w:pPr>
+            <w:r/>
+            <w:r>
+              <w:rPr>
+                <w:sz w:val="17"/>
+              </w:rPr>
+              <w:t>Disponibilidad</w:t>
+            </w:r>
+          </w:p>
+        </w:tc>
+        <w:tc>
+          <w:tcPr>
+            <w:tcW w:type="dxa" w:w="2154"/>
+          </w:tcPr>
+          <w:p>
+            <w:pPr>
+              <w:spacing w:after="40"/>
+            </w:pPr>
+            <w:r/>
+            <w:r>
+              <w:rPr>
+                <w:sz w:val="17"/>
+              </w:rPr>
+              <w:t>99 % del tiempo</w:t>
+            </w:r>
+          </w:p>
+        </w:tc>
+        <w:tc>
+          <w:tcPr>
+            <w:tcW w:type="dxa" w:w="2721"/>
+          </w:tcPr>
+          <w:p>
+            <w:pPr>
+              <w:spacing w:after="40"/>
+            </w:pPr>
+            <w:r/>
+            <w:r>
+              <w:rPr>
+                <w:sz w:val="17"/>
+              </w:rPr>
+              <w:t>95 % de los latidos en horario hábil, con cold start</w:t>
+            </w:r>
+          </w:p>
+        </w:tc>
+        <w:tc>
+          <w:tcPr>
+            <w:tcW w:type="dxa" w:w="3572"/>
+          </w:tcPr>
+          <w:p>
+            <w:pPr>
+              <w:spacing w:after="40"/>
+            </w:pPr>
+            <w:r/>
+            <w:r>
+              <w:rPr>
+                <w:sz w:val="17"/>
+              </w:rPr>
+              <w:t>El tier gratis de Render se duerme a los 15 minutos; 99 % no se puede sostener.</w:t>
+            </w:r>
+          </w:p>
+        </w:tc>
+      </w:tr>
+      <w:tr>
+        <w:trPr>
+          <w:cantSplit w:val="true"/>
+        </w:trPr>
+        <w:tc>
+          <w:tcPr>
+            <w:tcW w:type="dxa" w:w="1474"/>
+          </w:tcPr>
+          <w:p>
+            <w:pPr>
+              <w:spacing w:after="40"/>
+            </w:pPr>
+            <w:r/>
+            <w:r>
+              <w:rPr>
+                <w:sz w:val="17"/>
+              </w:rPr>
+              <w:t>Escalabilidad</w:t>
+            </w:r>
+          </w:p>
+        </w:tc>
+        <w:tc>
+          <w:tcPr>
+            <w:tcW w:type="dxa" w:w="2154"/>
+          </w:tcPr>
+          <w:p>
+            <w:pPr>
+              <w:spacing w:after="40"/>
+            </w:pPr>
+            <w:r/>
+            <w:r>
+              <w:rPr>
+                <w:sz w:val="17"/>
+              </w:rPr>
+              <w:t>RNF de escalabilidad con pruebas de estrés</w:t>
+            </w:r>
+          </w:p>
+        </w:tc>
+        <w:tc>
+          <w:tcPr>
+            <w:tcW w:type="dxa" w:w="2721"/>
+          </w:tcPr>
+          <w:p>
+            <w:pPr>
+              <w:spacing w:after="40"/>
+            </w:pPr>
+            <w:r/>
+            <w:r>
+              <w:rPr>
+                <w:sz w:val="17"/>
+              </w:rPr>
+              <w:t>No figura entre los 7 RNF aprobados</w:t>
+            </w:r>
+          </w:p>
+        </w:tc>
+        <w:tc>
+          <w:tcPr>
+            <w:tcW w:type="dxa" w:w="3572"/>
+          </w:tcPr>
+          <w:p>
+            <w:pPr>
+              <w:spacing w:after="40"/>
+            </w:pPr>
+            <w:r/>
+            <w:r>
+              <w:rPr>
+                <w:sz w:val="17"/>
+              </w:rPr>
+              <w:t>Una métrica por atributo ISO/IEC 25010 y sin instrumento no se compromete.</w:t>
+            </w:r>
+          </w:p>
+        </w:tc>
+      </w:tr>
+      <w:tr>
+        <w:trPr>
+          <w:cantSplit w:val="true"/>
+        </w:trPr>
+        <w:tc>
+          <w:tcPr>
+            <w:tcW w:type="dxa" w:w="1474"/>
+          </w:tcPr>
+          <w:p>
+            <w:pPr>
+              <w:spacing w:after="40"/>
+            </w:pPr>
+            <w:r/>
+            <w:r>
+              <w:rPr>
+                <w:sz w:val="17"/>
+              </w:rPr>
+              <w:t>Base de datos</w:t>
+            </w:r>
+          </w:p>
+        </w:tc>
+        <w:tc>
+          <w:tcPr>
+            <w:tcW w:type="dxa" w:w="2154"/>
+          </w:tcPr>
+          <w:p>
+            <w:pPr>
+              <w:spacing w:after="40"/>
+            </w:pPr>
+            <w:r/>
+            <w:r>
+              <w:rPr>
+                <w:sz w:val="17"/>
+              </w:rPr>
+              <w:t>MySQL; PostgreSQL 16 en la sección 8</w:t>
+            </w:r>
+          </w:p>
+        </w:tc>
+        <w:tc>
+          <w:tcPr>
+            <w:tcW w:type="dxa" w:w="2721"/>
+          </w:tcPr>
+          <w:p>
+            <w:pPr>
+              <w:spacing w:after="40"/>
+            </w:pPr>
+            <w:r/>
+            <w:r>
+              <w:rPr>
+                <w:sz w:val="17"/>
+              </w:rPr>
+              <w:t>PostgreSQL 17 en Supabase, con Flyway</w:t>
+            </w:r>
+          </w:p>
+        </w:tc>
+        <w:tc>
+          <w:tcPr>
+            <w:tcW w:type="dxa" w:w="3572"/>
+          </w:tcPr>
+          <w:p>
+            <w:pPr>
+              <w:spacing w:after="40"/>
+            </w:pPr>
+            <w:r/>
+            <w:r>
+              <w:rPr>
+                <w:sz w:val="17"/>
+              </w:rPr>
+              <w:t>Decisión de arquitectura vigente; un solo motor en todo el documento.</w:t>
+            </w:r>
+          </w:p>
+        </w:tc>
+      </w:tr>
+      <w:tr>
+        <w:trPr>
+          <w:cantSplit w:val="true"/>
+        </w:trPr>
+        <w:tc>
+          <w:tcPr>
+            <w:tcW w:type="dxa" w:w="1474"/>
+          </w:tcPr>
+          <w:p>
+            <w:pPr>
+              <w:spacing w:after="40"/>
+            </w:pPr>
+            <w:r/>
+            <w:r>
+              <w:rPr>
+                <w:sz w:val="17"/>
+              </w:rPr>
+              <w:t>Modelo de datos</w:t>
+            </w:r>
+          </w:p>
+        </w:tc>
+        <w:tc>
+          <w:tcPr>
+            <w:tcW w:type="dxa" w:w="2154"/>
+          </w:tcPr>
+          <w:p>
+            <w:pPr>
+              <w:spacing w:after="40"/>
+            </w:pPr>
+            <w:r/>
+            <w:r>
+              <w:rPr>
+                <w:sz w:val="17"/>
+              </w:rPr>
+              <w:t>7 tablas: usuario, ruta, ubicacion, ruta_parada, busqueda, comentario, favorito</w:t>
+            </w:r>
+          </w:p>
+        </w:tc>
+        <w:tc>
+          <w:tcPr>
+            <w:tcW w:type="dxa" w:w="2721"/>
+          </w:tcPr>
+          <w:p>
+            <w:pPr>
+              <w:spacing w:after="40"/>
+            </w:pPr>
+            <w:r/>
+            <w:r>
+              <w:rPr>
+                <w:sz w:val="17"/>
+              </w:rPr>
+              <w:t>4 tablas implementadas: users, routes, route_neighborhoods, fares</w:t>
+            </w:r>
+          </w:p>
+        </w:tc>
+        <w:tc>
+          <w:tcPr>
+            <w:tcW w:type="dxa" w:w="3572"/>
+          </w:tcPr>
+          <w:p>
+            <w:pPr>
+              <w:spacing w:after="40"/>
+            </w:pPr>
+            <w:r/>
+            <w:r>
+              <w:rPr>
+                <w:sz w:val="17"/>
+              </w:rPr>
+              <w:t>En Fusagasugá no hay paradas fijas (la buseta se para con la mano): los barrios son una lista de nombres. Historial, favoritos y comentarios se agregarán con sus historias.</w:t>
+            </w:r>
+          </w:p>
+        </w:tc>
+      </w:tr>
+      <w:tr>
+        <w:trPr>
+          <w:cantSplit w:val="true"/>
+        </w:trPr>
+        <w:tc>
+          <w:tcPr>
+            <w:tcW w:type="dxa" w:w="1474"/>
+          </w:tcPr>
+          <w:p>
+            <w:pPr>
+              <w:spacing w:after="40"/>
+            </w:pPr>
+            <w:r/>
+            <w:r>
+              <w:rPr>
+                <w:sz w:val="17"/>
+              </w:rPr>
+              <w:t>Dependencias</w:t>
+            </w:r>
+          </w:p>
+        </w:tc>
+        <w:tc>
+          <w:tcPr>
+            <w:tcW w:type="dxa" w:w="2154"/>
+          </w:tcPr>
+          <w:p>
+            <w:pPr>
+              <w:spacing w:after="40"/>
+            </w:pPr>
+            <w:r/>
+            <w:r>
+              <w:rPr>
+                <w:sz w:val="17"/>
+              </w:rPr>
+              <w:t>Base de datos, Leaflet/Google Maps, Git/GitHub</w:t>
+            </w:r>
+          </w:p>
+        </w:tc>
+        <w:tc>
+          <w:tcPr>
+            <w:tcW w:type="dxa" w:w="2721"/>
+          </w:tcPr>
+          <w:p>
+            <w:pPr>
+              <w:spacing w:after="40"/>
+            </w:pPr>
+            <w:r/>
+            <w:r>
+              <w:rPr>
+                <w:sz w:val="17"/>
+              </w:rPr>
+              <w:t>Se agregan Supabase, Render, Vercel, CI y datos de las rutas; Google Maps solo cronometra</w:t>
+            </w:r>
+          </w:p>
+        </w:tc>
+        <w:tc>
+          <w:tcPr>
+            <w:tcW w:type="dxa" w:w="3572"/>
+          </w:tcPr>
+          <w:p>
+            <w:pPr>
+              <w:spacing w:after="40"/>
+            </w:pPr>
+            <w:r/>
+            <w:r>
+              <w:rPr>
+                <w:sz w:val="17"/>
+              </w:rPr>
+              <w:t>Reflejar las dependencias reales del despliegue.</w:t>
+            </w:r>
+          </w:p>
+        </w:tc>
+      </w:tr>
+      <w:tr>
+        <w:trPr>
+          <w:cantSplit w:val="true"/>
+        </w:trPr>
+        <w:tc>
+          <w:tcPr>
+            <w:tcW w:type="dxa" w:w="1474"/>
+          </w:tcPr>
+          <w:p>
+            <w:pPr>
+              <w:spacing w:after="40"/>
+            </w:pPr>
+            <w:r/>
+            <w:r>
+              <w:rPr>
+                <w:sz w:val="17"/>
+              </w:rPr>
+              <w:t>Riesgos</w:t>
+            </w:r>
+          </w:p>
+        </w:tc>
+        <w:tc>
+          <w:tcPr>
+            <w:tcW w:type="dxa" w:w="2154"/>
+          </w:tcPr>
+          <w:p>
+            <w:pPr>
+              <w:spacing w:after="40"/>
+            </w:pPr>
+            <w:r/>
+            <w:r>
+              <w:rPr>
+                <w:sz w:val="17"/>
+              </w:rPr>
+              <w:t>3 riesgos</w:t>
+            </w:r>
+          </w:p>
+        </w:tc>
+        <w:tc>
+          <w:tcPr>
+            <w:tcW w:type="dxa" w:w="2721"/>
+          </w:tcPr>
+          <w:p>
+            <w:pPr>
+              <w:spacing w:after="40"/>
+            </w:pPr>
+            <w:r/>
+            <w:r>
+              <w:rPr>
+                <w:sz w:val="17"/>
+              </w:rPr>
+              <w:t>8, con su estado real</w:t>
+            </w:r>
+          </w:p>
+        </w:tc>
+        <w:tc>
+          <w:tcPr>
+            <w:tcW w:type="dxa" w:w="3572"/>
+          </w:tcPr>
+          <w:p>
+            <w:pPr>
+              <w:spacing w:after="40"/>
+            </w:pPr>
+            <w:r/>
+            <w:r>
+              <w:rPr>
+                <w:sz w:val="17"/>
+              </w:rPr>
+              <w:t>Varios ya se materializaron (Sprint 1 con velocidad 0).</w:t>
+            </w:r>
+          </w:p>
+        </w:tc>
+      </w:tr>
+    </w:tbl>
+    <w:p>
+      <w:pPr>
+        <w:spacing w:after="80"/>
+      </w:pPr>
+    </w:p>
+    <w:p>
+      <w:pPr>
+        <w:pStyle w:val="Heading3"/>
+      </w:pPr>
+      <w:r>
+        <w:t>Cambios posteriores al 24/08 que ya estaban en la Actividad 3</w:t>
       </w:r>
     </w:p>
     <w:tbl>

</xml_diff>